<commit_message>
dynamically rendered properties app and designed the front end
</commit_message>
<xml_diff>
--- a/docs/System Analysis PK.docx
+++ b/docs/System Analysis PK.docx
@@ -294,6 +294,21 @@
     </w:p>
     <w:p/>
     <w:p/>
+    <w:p>
+      <w:pPr>
+        <w:rPr>
+          <w:b/>
+          <w:bCs/>
+        </w:rPr>
+      </w:pPr>
+      <w:r>
+        <w:rPr>
+          <w:b/>
+          <w:bCs/>
+        </w:rPr>
+        <w:t>Agents</w:t>
+      </w:r>
+    </w:p>
     <w:p/>
     <w:sectPr>
       <w:pgSz w:w="12240" w:h="15840"/>

</xml_diff>